<commit_message>
Just finishing frog write up of results. Moving on to the snakes and lizards... soooo slowly
</commit_message>
<xml_diff>
--- a/RESULTS.docx
+++ b/RESULTS.docx
@@ -24,15 +24,7 @@
     </w:p>
     <w:p>
       <w:r>
-        <w:t xml:space="preserve">Understory vegetation density did not vary significantly along survey routes in the hunted and unhunted forests. Mean vertical leaf </w:t>
-      </w:r>
-      <w:proofErr w:type="gramStart"/>
-      <w:r>
-        <w:t>overlap</w:t>
-      </w:r>
-      <w:proofErr w:type="gramEnd"/>
-      <w:r>
-        <w:t xml:space="preserve"> in the hunted forest was 2.24, SD = 1.92 and mean = 2.30, SD = 2.12 in the unhunted forest (Supplementary Figure 1).</w:t>
+        <w:t>Understory vegetation density did not vary significantly along survey routes in the hunted and unhunted forests. Mean vertical leaf overlap in the hunted forest was 2.24, SD = 1.92 and mean = 2.30, SD = 2.12 in the unhunted forest (Supplementary Figure 1).</w:t>
       </w:r>
     </w:p>
     <w:p>
@@ -96,15 +88,7 @@
     </w:p>
     <w:p>
       <w:r>
-        <w:t xml:space="preserve">Relative humidity also varied between years and forest types during our study (Supplementary Figure 3). Mean relative humidity in 2025 during afternoon surveys was 89.53% (SD = 4.62) and 88.01% (SD = 9.21) in the unhunted and hunted forests, respectively. Nighttime surveys in 2025 had </w:t>
-      </w:r>
-      <w:proofErr w:type="gramStart"/>
-      <w:r>
-        <w:t>mean</w:t>
-      </w:r>
-      <w:proofErr w:type="gramEnd"/>
-      <w:r>
-        <w:t xml:space="preserve"> relative humidities of 91.35% (SD = 4.16) in the unhunted and 93.87% (SD = 3.72) in the hunted forest. In 2024, surveys were only conducted at night and mean relative humidities were 88.87% (SD = 5.27) in the unhunted forest and 90.17% (SD = 4.31) in the hunted forest.</w:t>
+        <w:t>Relative humidity also varied between years and forest types during our study (Supplementary Figure 3). Mean relative humidity in 2025 during afternoon surveys was 89.53% (SD = 4.62) and 88.01% (SD = 9.21) in the unhunted and hunted forests, respectively. Nighttime surveys in 2025 had mean relative humidities of 91.35% (SD = 4.16) in the unhunted and 93.87% (SD = 3.72) in the hunted forest. In 2024, surveys were only conducted at night and mean relative humidities were 88.87% (SD = 5.27) in the unhunted forest and 90.17% (SD = 4.31) in the hunted forest.</w:t>
       </w:r>
     </w:p>
     <w:p>
@@ -272,44 +256,32 @@
         <w:t>h</w:t>
       </w:r>
       <w:r>
-        <w:t xml:space="preserve">unting </w:t>
+        <w:t>unting</w:t>
       </w:r>
       <w:r>
-        <w:t>s</w:t>
+        <w:t>, and the family X</w:t>
       </w:r>
       <w:r>
-        <w:t xml:space="preserve">tatus and </w:t>
+        <w:t xml:space="preserve"> </w:t>
       </w:r>
       <w:r>
         <w:t>h</w:t>
       </w:r>
       <w:r>
-        <w:t xml:space="preserve">umidity, as well as an interaction term for </w:t>
+        <w:t>umidity</w:t>
       </w:r>
       <w:r>
-        <w:t>h</w:t>
-      </w:r>
-      <w:r>
-        <w:t xml:space="preserve">umidity and </w:t>
-      </w:r>
-      <w:r>
-        <w:t>f</w:t>
-      </w:r>
-      <w:r>
-        <w:t xml:space="preserve">amily and </w:t>
+        <w:t xml:space="preserve"> and family X hunting interaction terms. We found that </w:t>
       </w:r>
       <w:r>
         <w:lastRenderedPageBreak/>
-        <w:t>h</w:t>
+        <w:t xml:space="preserve">while there was no significant effect of hunting on total frog detections (X2 = 1.47, Df = 1, p = 0.22), there was a difference in detections in the hunted and unhunted study areas for some (family X hunting interaction (X2 = 32.72, DF = 10, p &lt; 0.001) (Fig XX). Family on its own was a significant predictor of detection rate (X2 = 262.99, DF = 10, p &lt; 0.001) as was the interaction between family X humidity (X2 = 22.06, DF = 11, p = 0.02) </w:t>
       </w:r>
       <w:r>
-        <w:t xml:space="preserve">unting </w:t>
+        <w:t xml:space="preserve">(supp fig xx) </w:t>
       </w:r>
       <w:r>
-        <w:t>s</w:t>
-      </w:r>
-      <w:r>
-        <w:t>tatus and family (</w:t>
+        <w:t>(</w:t>
       </w:r>
       <w:r>
         <w:rPr>
@@ -318,166 +290,7 @@
         <w:t>see Supplementary Table S# for model selection table</w:t>
       </w:r>
       <w:r>
-        <w:t>). Model results showed a significant interaction between family and hunting status (</w:t>
-      </w:r>
-      <w:r>
-        <w:rPr>
-          <w:i/>
-          <w:iCs/>
-        </w:rPr>
-        <w:t>X</w:t>
-      </w:r>
-      <w:r>
-        <w:rPr>
-          <w:i/>
-          <w:iCs/>
-          <w:vertAlign w:val="superscript"/>
-        </w:rPr>
-        <w:t>2</w:t>
-      </w:r>
-      <w:r>
-        <w:t xml:space="preserve"> </w:t>
-      </w:r>
-      <w:r>
-        <w:t xml:space="preserve">= 35.89, df = 10, </w:t>
-      </w:r>
-      <w:r>
-        <w:rPr>
-          <w:i/>
-          <w:iCs/>
-        </w:rPr>
-        <w:t>p</w:t>
-      </w:r>
-      <w:r>
-        <w:t xml:space="preserve"> &lt; 0.001) and for the interaction between family and humidity </w:t>
-      </w:r>
-      <w:r>
-        <w:t>(</w:t>
-      </w:r>
-      <w:r>
-        <w:rPr>
-          <w:i/>
-          <w:iCs/>
-        </w:rPr>
-        <w:t>X</w:t>
-      </w:r>
-      <w:r>
-        <w:rPr>
-          <w:i/>
-          <w:iCs/>
-          <w:vertAlign w:val="superscript"/>
-        </w:rPr>
-        <w:t>2</w:t>
-      </w:r>
-      <w:r>
-        <w:t xml:space="preserve"> =</w:t>
-      </w:r>
-      <w:r>
-        <w:t xml:space="preserve"> 31.68, df = 10, </w:t>
-      </w:r>
-      <w:r>
-        <w:rPr>
-          <w:i/>
-          <w:iCs/>
-        </w:rPr>
-        <w:t>p</w:t>
-      </w:r>
-      <w:r>
-        <w:t xml:space="preserve"> &lt; 0.001). Family was also significant (</w:t>
-      </w:r>
-      <w:r>
-        <w:rPr>
-          <w:i/>
-          <w:iCs/>
-        </w:rPr>
-        <w:t>X</w:t>
-      </w:r>
-      <w:r>
-        <w:rPr>
-          <w:i/>
-          <w:iCs/>
-          <w:vertAlign w:val="superscript"/>
-        </w:rPr>
-        <w:t>2</w:t>
-      </w:r>
-      <w:r>
-        <w:t xml:space="preserve"> = 254.39, df = 10, </w:t>
-      </w:r>
-      <w:r>
-        <w:rPr>
-          <w:i/>
-          <w:iCs/>
-        </w:rPr>
-        <w:t>p</w:t>
-      </w:r>
-      <w:r>
-        <w:t xml:space="preserve"> &lt; 0.001), while the fixed effect of hunting status was not (</w:t>
-      </w:r>
-      <w:r>
-        <w:rPr>
-          <w:i/>
-          <w:iCs/>
-        </w:rPr>
-        <w:t>X</w:t>
-      </w:r>
-      <w:r>
-        <w:rPr>
-          <w:vertAlign w:val="superscript"/>
-        </w:rPr>
-        <w:t>2</w:t>
-      </w:r>
-      <w:r>
-        <w:t xml:space="preserve"> = 1.29, df = 1, </w:t>
-      </w:r>
-      <w:r>
-        <w:rPr>
-          <w:i/>
-          <w:iCs/>
-        </w:rPr>
-        <w:t>p</w:t>
-      </w:r>
-      <w:r>
-        <w:t xml:space="preserve"> =</w:t>
-      </w:r>
-      <w:r>
-        <w:t xml:space="preserve"> </w:t>
-      </w:r>
-      <w:r>
-        <w:t>0.26) nor was humidity (</w:t>
-      </w:r>
-      <w:r>
-        <w:rPr>
-          <w:i/>
-          <w:iCs/>
-        </w:rPr>
-        <w:t>X</w:t>
-      </w:r>
-      <w:r>
-        <w:rPr>
-          <w:i/>
-          <w:iCs/>
-          <w:vertAlign w:val="superscript"/>
-        </w:rPr>
-        <w:t>2</w:t>
-      </w:r>
-      <w:r>
-        <w:t xml:space="preserve"> </w:t>
-      </w:r>
-      <w:r>
-        <w:t>= 1.</w:t>
-      </w:r>
-      <w:r>
-        <w:t xml:space="preserve">55, df = 1, </w:t>
-      </w:r>
-      <w:r>
-        <w:rPr>
-          <w:i/>
-          <w:iCs/>
-        </w:rPr>
-        <w:t>p</w:t>
-      </w:r>
-      <w:r>
-        <w:t xml:space="preserve"> = 0.21)</w:t>
+        <w:t>)</w:t>
       </w:r>
       <w:r>
         <w:t>.</w:t>
@@ -561,15 +374,7 @@
     </w:p>
     <w:p>
       <w:r>
-        <w:t xml:space="preserve">Overall, the number of snake detections did not vary between the forest types. We detected 51 individual snakes in total in the unhunted forest (mean per survey = 1.70 ± 0.31, SD = 1.68) and 50 in the hunted forest (mean per survey = 1.61 ± 0.26, SD = 1.43) (Figure XX). Investigated predictor variables (hunting, humidity, and temperature) did not improve model fit, making </w:t>
-      </w:r>
-      <w:proofErr w:type="gramStart"/>
-      <w:r>
-        <w:t>the our</w:t>
-      </w:r>
-      <w:proofErr w:type="gramEnd"/>
-      <w:r>
-        <w:t xml:space="preserve"> top model (Tweedie GLMM, intercept estimate = -1.19 ± 0.15 SE, Z-value = -7.70, </w:t>
+        <w:t xml:space="preserve">Overall, the number of snake detections did not vary between the forest types. We detected 51 individual snakes in total in the unhunted forest (mean per survey = 1.70 ± 0.31, SD = 1.68) and 50 in the hunted forest (mean per survey = 1.61 ± 0.26, SD = 1.43) (Figure XX). Investigated predictor variables (hunting, humidity, and temperature) did not improve model fit, making the our top model (Tweedie GLMM, intercept estimate = -1.19 ± 0.15 SE, Z-value = -7.70, </w:t>
       </w:r>
       <w:r>
         <w:rPr>
@@ -649,7 +454,6 @@
       <w:r>
         <w:t xml:space="preserve"> Detection rates of snakes and their prey across hunted and unhunted forests. Detections are measured as a rate of </w:t>
       </w:r>
-      <w:proofErr w:type="gramStart"/>
       <w:r>
         <w:rPr>
           <w:i/>
@@ -658,11 +462,7 @@
         <w:t>n</w:t>
       </w:r>
       <w:r>
-        <w:t xml:space="preserve"> individuals</w:t>
-      </w:r>
-      <w:proofErr w:type="gramEnd"/>
-      <w:r>
-        <w:t xml:space="preserve"> encountered per 500 meters. Points represent mean detections, and error bars represent standard error of the mean.</w:t>
+        <w:t xml:space="preserve"> individuals encountered per 500 meters. Points represent mean detections, and error bars represent standard error of the mean.</w:t>
       </w:r>
     </w:p>
     <w:p/>
@@ -683,23 +483,7 @@
       </w:r>
       <w:r>
         <w:lastRenderedPageBreak/>
-        <w:t xml:space="preserve">both the hunted and unhunted </w:t>
-      </w:r>
-      <w:proofErr w:type="gramStart"/>
-      <w:r>
-        <w:t>site</w:t>
-      </w:r>
-      <w:proofErr w:type="gramEnd"/>
-      <w:r>
-        <w:t xml:space="preserve"> were dominated by species from the family Colubridae, but the hunted site visibly exhibited higher proportions of species from the family Boidae (Supplementary Figure 9). When opportunistic and third-party detections were </w:t>
-      </w:r>
-      <w:proofErr w:type="gramStart"/>
-      <w:r>
-        <w:t>taken into account</w:t>
-      </w:r>
-      <w:proofErr w:type="gramEnd"/>
-      <w:r>
-        <w:t xml:space="preserve">, the highest occurring groups come from the genera </w:t>
+        <w:t xml:space="preserve">both the hunted and unhunted site were dominated by species from the family Colubridae, but the hunted site visibly exhibited higher proportions of species from the family Boidae (Supplementary Figure 9). When opportunistic and third-party detections were taken into account, the highest occurring groups come from the genera </w:t>
       </w:r>
       <w:r>
         <w:rPr>
@@ -22021,23 +21805,7 @@
                 <w:b/>
                 <w:bCs/>
               </w:rPr>
-              <w:t>Predicted (</w:t>
-            </w:r>
-            <w:proofErr w:type="gramStart"/>
-            <w:r>
-              <w:rPr>
-                <w:b/>
-                <w:bCs/>
-              </w:rPr>
-              <w:t>n individuals</w:t>
-            </w:r>
-            <w:proofErr w:type="gramEnd"/>
-            <w:r>
-              <w:rPr>
-                <w:b/>
-                <w:bCs/>
-              </w:rPr>
-              <w:t xml:space="preserve"> per km</w:t>
+              <w:t>Predicted (n individuals per km</w:t>
             </w:r>
             <w:r>
               <w:rPr>
@@ -24190,23 +23958,7 @@
                 <w:b/>
                 <w:bCs/>
               </w:rPr>
-              <w:t>Predicted (</w:t>
-            </w:r>
-            <w:proofErr w:type="gramStart"/>
-            <w:r>
-              <w:rPr>
-                <w:b/>
-                <w:bCs/>
-              </w:rPr>
-              <w:t>n individuals</w:t>
-            </w:r>
-            <w:proofErr w:type="gramEnd"/>
-            <w:r>
-              <w:rPr>
-                <w:b/>
-                <w:bCs/>
-              </w:rPr>
-              <w:t xml:space="preserve"> per km</w:t>
+              <w:t>Predicted (n individuals per km</w:t>
             </w:r>
             <w:r>
               <w:rPr>
@@ -25569,6 +25321,7 @@
   <w:style w:type="character" w:default="1" w:styleId="DefaultParagraphFont">
     <w:name w:val="Default Paragraph Font"/>
     <w:uiPriority w:val="1"/>
+    <w:semiHidden/>
     <w:unhideWhenUsed/>
   </w:style>
   <w:style w:type="table" w:default="1" w:styleId="TableNormal">

</xml_diff>